<commit_message>
Rechoose notes 5 to 7 from common candidate questions
Replace the notice-driven topics with three questions that come up
repeatedly in public discussions: whether non-tenured posts are worth
taking, why top written scores lose at interview, and whether
non-party members can apply for counselor posts. Rebuild the Word file.

Co-authored-by: nancyx461-art <nancyx461-art@users.noreply.github.com>
</commit_message>
<xml_diff>
--- a/content/xhs-gaoxiao-beikao/高校考编备考笔记-第5-7篇.docx
+++ b/content/xhs-gaoxiao-beikao/高校考编备考笔记-第5-7篇.docx
@@ -15,7 +15,17 @@
         <w:pStyle w:val="Heading1"/>
       </w:pPr>
       <w:r>
-        <w:t>第5篇｜资格复审材料</w:t>
+        <w:t>第5篇｜没编制的高校岗值不值得去</w:t>
+      </w:r>
+    </w:p>
+    <w:p>
+      <w:r>
+        <w:rPr>
+          <w:i/>
+          <w:color w:val="666666"/>
+          <w:sz w:val="18"/>
+        </w:rPr>
+        <w:t>讨论来源：高校人才网“没有编制值得去吗”“合同制行政岗值得去吗”等文章和求职群提问，求职论坛里考生分享的无编岗经历。事实依据：山东大学2026年辅导员招聘公告（预聘制）；西安财经大学人事代理转编条件；2017年《新形势下高校人事代理制度的实施及其合理性探析》中安徽省属高校的待遇调研。</w:t>
       </w:r>
     </w:p>
     <w:p>
@@ -27,8 +37,11 @@
       </w:r>
     </w:p>
     <w:p>
+      <w:pPr>
+        <w:spacing w:after="160"/>
+      </w:pPr>
       <w:r>
-        <w:t>笔试过了，复审别被刷</w:t>
+        <w:t>没编制的高校岗值不值得去</w:t>
       </w:r>
     </w:p>
     <w:p>
@@ -40,13 +53,15 @@
       </w:r>
     </w:p>
     <w:p>
+      <w:pPr>
+        <w:spacing w:after="160"/>
+      </w:pPr>
       <w:r>
-        <w:t>进面之前</w:t>
+        <w:t>参照事业编</w:t>
+        <w:br/>
       </w:r>
-    </w:p>
-    <w:p>
       <w:r>
-        <w:t>还有一次资格复审</w:t>
+        <w:t>不等于有编</w:t>
       </w:r>
     </w:p>
     <w:p>
@@ -62,7 +77,15 @@
         <w:spacing w:after="160"/>
       </w:pPr>
       <w:r>
-        <w:t>高校招聘的流程，多数是报名、资格初审、笔试、资格复审、面试。报名时系统审过了，不代表复审能过。复审不符合条件的，取消面试资格，由后一名递补。笔试成绩出来再准备材料，常常来不及。</w:t>
+        <w:t>最近被问得最多的一句：拿到了高校的人事代理、合同制或预聘岗，没有编，要不要去？</w:t>
+      </w:r>
+    </w:p>
+    <w:p>
+      <w:pPr>
+        <w:spacing w:after="160"/>
+      </w:pPr>
+      <w:r>
+        <w:t>先说结论：去不去，取决于入职前能不能问清五件事。公告里写的“参照事业编制人员待遇”，指的通常是工资标准，不一定包括其他待遇。</w:t>
       </w:r>
     </w:p>
     <w:p>
@@ -73,19 +96,11 @@
         <w:rPr>
           <w:b/>
         </w:rPr>
-        <w:t>1⃣️学历学位</w:t>
+        <w:t>1⃣️工资参照的是哪一部分</w:t>
         <w:br/>
       </w:r>
       <w:r>
-        <w:t>往届生带毕业证、学位证原件和复印件，再从学信网下载学历证书电子注册备案表，或学历认证报告，加上学位在线验证报告。</w:t>
-        <w:br/>
-      </w:r>
-      <w:r>
-        <w:t>2026届还没拿到证的，看公告要哪一样：有的要学校教务处盖章的预计毕业证明，有的要就业推荐表加学籍在线验证报告。证书最晚取得时间也写在公告里，有的写7月31日，有的写12月31日。</w:t>
-        <w:br/>
-      </w:r>
-      <w:r>
-        <w:t>留学回国的，要教育部留学服务中心的国外学历学位认证书。</w:t>
+        <w:t>有的学校写薪酬参照同岗位在编人员，有的只写按学校规定执行。基本工资和绩效是否一样，年终怎么发，问人事处，不只听用人部门口头说。</w:t>
       </w:r>
     </w:p>
     <w:p>
@@ -96,11 +111,11 @@
         <w:rPr>
           <w:b/>
         </w:rPr>
-        <w:t>2⃣️专业对不上</w:t>
+        <w:t>2⃣️社保和年金</w:t>
         <w:br/>
       </w:r>
       <w:r>
-        <w:t>毕业证上是一级学科，岗位要求二级学科；或者专业名称和目录不完全一样。这两种情况，要准备学校开具的研究方向说明、课程或学科专业证明。</w:t>
+        <w:t>在编人员参加机关事业单位养老保险，并缴纳职业年金。无编岗位常见的是地方城镇职工社保。2017年对安徽省属高校的调研发现，多数学校没有给人事代理人员缴职业年金，住房补贴也有差别。退休待遇的差距，主要出在这里。</w:t>
       </w:r>
     </w:p>
     <w:p>
@@ -111,11 +126,11 @@
         <w:rPr>
           <w:b/>
         </w:rPr>
-        <w:t>3⃣️“高校毕业生”岗位</w:t>
+        <w:t>3⃣️有没有转编通道</w:t>
         <w:br/>
       </w:r>
       <w:r>
-        <w:t>2026届之外，2024、2025届择业期内未落实工作单位的也能报。要求是户口、档案、组织关系还在原学校，或在毕业生就业、人才服务机构。复审要档案存放证明，有的还要本人签字的未落实工作单位承诺书。已经交过社保、签过单位的，先看公告怎么认定。</w:t>
+        <w:t>各校差别很大。山东大学2026年辅导员预聘岗写明，预聘期三年，期满考核优秀的可以聘到事业编制岗位。西安财经大学规定，人事代理人员取得博士学位、获得副高职称或受聘副处级岗位，满足其中一条即可申请转编。也有学校明确不能转编。只写了“有机会”的，问近三年实际转了几个人。</w:t>
       </w:r>
     </w:p>
     <w:p>
@@ -126,15 +141,11 @@
         <w:rPr>
           <w:b/>
         </w:rPr>
-        <w:t>4⃣️党员和经历</w:t>
+        <w:t>4⃣️合同期和考核</w:t>
         <w:br/>
       </w:r>
       <w:r>
-        <w:t>党员证明由组织关系所在党委开，写明入党时间、党费交纳情况，盖章、签日期。有的学校要求6个月内开具。</w:t>
-        <w:br/>
-      </w:r>
-      <w:r>
-        <w:t>学生干部、辅导员经历，有的学校只认校级学生工作部门开的证明，学院开的不一定算。</w:t>
+        <w:t>人事代理、合同制一般一到三年一签。很多学校在合同里写明，聘期考核不达标的调岗、降薪或解聘。问清楚考核看什么、不续签的比例多高。</w:t>
       </w:r>
     </w:p>
     <w:p>
@@ -145,11 +156,11 @@
         <w:rPr>
           <w:b/>
         </w:rPr>
-        <w:t>5⃣️在职报考</w:t>
+        <w:t>5⃣️能不能晋升</w:t>
         <w:br/>
       </w:r>
       <w:r>
-        <w:t>在职的要单位同意报考的证明。在编人员还要已过试用期、最低服务年限的证明。</w:t>
+        <w:t>职称可以参评，但有分享者提到实际评上的比例比在编人员低。管理岗职级有的只在校内认定，副处以上需要报上级备案，不在编很难走上去。</w:t>
       </w:r>
     </w:p>
     <w:p>
@@ -157,7 +168,7 @@
         <w:spacing w:after="160"/>
       </w:pPr>
       <w:r>
-        <w:t>所有复印件写“此复印件与原件一致”，本人签字。准备之前，把这次公告的复审要求从头对一遍，每所学校的写法都不完全一样。</w:t>
+        <w:t>所以看三点。工资和社保接近在编、转编条件写在制度里、合同考核标准清楚，这类岗位可以当作进入高校的第一步。只有口头承诺、劳务派遣公司签合同的，要慎重。</w:t>
       </w:r>
     </w:p>
     <w:p>
@@ -165,7 +176,7 @@
         <w:spacing w:after="160"/>
       </w:pPr>
       <w:r>
-        <w:t>你最没把握的是哪一份材料？评论区打出来。</w:t>
+        <w:t>你拿到的岗位，合同写的是哪一种？评论区说说。</w:t>
       </w:r>
     </w:p>
     <w:p>
@@ -177,8 +188,11 @@
       </w:r>
     </w:p>
     <w:p>
+      <w:pPr>
+        <w:spacing w:after="160"/>
+      </w:pPr>
       <w:r>
-        <w:t>#资格复审 #高校招聘 #事业编 #高校行政 #辅导员招聘 #应届生 #择业期</w:t>
+        <w:t>#高校编制 #人事代理 #备案制 #合同制 #高校行政 #高校辅导员 #高校求职</w:t>
       </w:r>
     </w:p>
     <w:p>
@@ -190,8 +204,11 @@
       </w:r>
     </w:p>
     <w:p>
+      <w:pPr>
+        <w:spacing w:after="160"/>
+      </w:pPr>
       <w:r>
-        <w:t>最常卡人的四样：应届生没证要哪份替代材料；专业对不上要研究方向说明；择业期身份要档案存放证明；党员证明要党委盖章、写入党时间和党费情况。以本场公告为准。</w:t>
+        <w:t>入职前问五件事：工资参照哪一部分；社保是机关事业养老还是地方社保，有没有职业年金；转编条件和近三年转编人数；合同期和考核标准；职称、职级能不能正常晋升。</w:t>
       </w:r>
     </w:p>
     <w:p>
@@ -204,7 +221,17 @@
         <w:pStyle w:val="Heading1"/>
       </w:pPr>
       <w:r>
-        <w:t>第6篇｜高校面试怎么答</w:t>
+        <w:t>第6篇｜笔试第一，面试被刷</w:t>
+      </w:r>
+    </w:p>
+    <w:p>
+      <w:r>
+        <w:rPr>
+          <w:i/>
+          <w:color w:val="666666"/>
+          <w:sz w:val="18"/>
+        </w:rPr>
+        <w:t>讨论来源：求职论坛和公考机构文章里“笔试过了面试总被刷”的提问；2026年7月各地高校辅导员、行政岗面试真题回忆；2026年8月佛山季华中学招聘面试事件的官方通报。事实依据：江苏师范大学、南京信息工程大学、武汉软件工程职业学院、湖北省统一招聘辅导员的2026年公告。</w:t>
       </w:r>
     </w:p>
     <w:p>
@@ -216,8 +243,11 @@
       </w:r>
     </w:p>
     <w:p>
+      <w:pPr>
+        <w:spacing w:after="160"/>
+      </w:pPr>
       <w:r>
-        <w:t>高校面试占60%怎么准备</w:t>
+        <w:t>笔试第一，面试为什么被刷</w:t>
       </w:r>
     </w:p>
     <w:p>
@@ -229,13 +259,15 @@
       </w:r>
     </w:p>
     <w:p>
+      <w:pPr>
+        <w:spacing w:after="160"/>
+      </w:pPr>
       <w:r>
-        <w:t>笔试第一</w:t>
+        <w:t>面试占六七成</w:t>
+        <w:br/>
       </w:r>
-    </w:p>
-    <w:p>
       <w:r>
-        <w:t>也会被面试反超</w:t>
+        <w:t>还有合格线</w:t>
       </w:r>
     </w:p>
     <w:p>
@@ -251,23 +283,7 @@
         <w:spacing w:after="160"/>
       </w:pPr>
       <w:r>
-        <w:t>不少高校的综合成绩，是笔试40%加面试60%，也有各占一半的。笔试拉开的几分，面试一道题就能追回来。所以面试不能等名单出来才开始练。</w:t>
-      </w:r>
-    </w:p>
-    <w:p>
-      <w:pPr>
-        <w:spacing w:after="160"/>
-      </w:pPr>
-      <w:r>
-        <w:t>高校管理岗和辅导员，常见的是结构化面试。有的学校还有部门面试、人事处面试或无领导小组讨论，形式看面试公告。</w:t>
-      </w:r>
-    </w:p>
-    <w:p>
-      <w:pPr>
-        <w:spacing w:after="160"/>
-      </w:pPr>
-      <w:r>
-        <w:t>结构化面试大多是这几类题：</w:t>
+        <w:t>“笔试第一，面试被刷”，几乎每场高校招聘结束都有人这么问。先看公告怎么算分，很多时候从规则上就能看出原因。</w:t>
       </w:r>
     </w:p>
     <w:p>
@@ -278,11 +294,11 @@
         <w:rPr>
           <w:b/>
         </w:rPr>
-        <w:t>1⃣️岗位认知</w:t>
+        <w:t>1⃣️面试占比高，还设了合格线</w:t>
         <w:br/>
       </w:r>
       <w:r>
-        <w:t>例如“你为什么来高校做行政”。说三点：这个岗位做什么，你做过什么相近的事，进来之后先把哪件事做好。不要只讲高校稳定。</w:t>
+        <w:t>南京信息工程大学2026年辅导员招聘，笔试占40%，面试占60%。江苏师范大学是笔试30%、面试70%。武汉软件工程职业学院和南京信息工程大学都要求面试达到70分。面试不合格，笔试再高也进不了体检。</w:t>
       </w:r>
     </w:p>
     <w:p>
@@ -293,11 +309,11 @@
         <w:rPr>
           <w:b/>
         </w:rPr>
-        <w:t>2⃣️综合分析</w:t>
+        <w:t>2⃣️考官不看你是谁</w:t>
         <w:br/>
       </w:r>
       <w:r>
-        <w:t>给一个现象或一句话谈看法。先表态，再说原因和影响，最后落到学校里能做的事。和笔试论述同一个顺序，用嘴说要短一些。</w:t>
+        <w:t>湖北省2026年统一招聘辅导员的面试公告规定，答题时不能透露本人姓名，穿戴有明显特征的服装、饰品也会被取消资格。有的学校还采用编号盲评。考官只能根据十分钟里你说了什么来打分。</w:t>
       </w:r>
     </w:p>
     <w:p>
@@ -308,11 +324,15 @@
         <w:rPr>
           <w:b/>
         </w:rPr>
-        <w:t>3⃣️组织协调</w:t>
+        <w:t>3⃣️常见的丢分原因</w:t>
         <w:br/>
       </w:r>
       <w:r>
-        <w:t>例如“组织一次毕业生座谈会”。按时间顺序讲：会前定对象、议题和场地，会中谁主持、谁记录，会后整理意见报给领导。</w:t>
+        <w:t>2026年7月的考生回忆里，有学校10分钟答3道题，没有草稿纸。常见题目比如：奖助学金评定后学生发短视频抹黑学校，作为辅导员怎么处理；学生在宿舍长期被排挤怎么办。</w:t>
+        <w:br/>
+      </w:r>
+      <w:r>
+        <w:t>丢分大多出在三处：开口卡住、找不到顺序；答案空泛，不像是会处理这件事的人；一道题里混了两类题，只答了一半。</w:t>
       </w:r>
     </w:p>
     <w:p>
@@ -323,11 +343,19 @@
         <w:rPr>
           <w:b/>
         </w:rPr>
-        <w:t>4⃣️应急应变</w:t>
+        <w:t>4⃣️怎么补</w:t>
         <w:br/>
       </w:r>
       <w:r>
-        <w:t>例如“晚上接到学生在校外受伤的电话”。先确认人身安全，联系医院和家长，同时报告学院领导和学生工作部门，事后写情况说明。先处理人，再处理事。</w:t>
+        <w:t>准备1分钟、3分钟两个版本的自我介绍。自我介绍不罗列奖项，每说一项能力，就配一件做过的事。</w:t>
+        <w:br/>
+      </w:r>
+      <w:r>
+        <w:t>练题先画逻辑框架，看着框架说，并录音，一道题练到流利为止。</w:t>
+        <w:br/>
+      </w:r>
+      <w:r>
+        <w:t>网上很多“高校行政岗真题集”是编的，有上岸的人专门提醒过。结构化面试的题型大同小异，用公开分享的题练就够了。</w:t>
       </w:r>
     </w:p>
     <w:p>
@@ -338,11 +366,11 @@
         <w:rPr>
           <w:b/>
         </w:rPr>
-        <w:t>5⃣️人际沟通</w:t>
+        <w:t>5⃣️觉得结果不对怎么办</w:t>
         <w:br/>
       </w:r>
       <w:r>
-        <w:t>例如“学生干部不配合你的工作”。先找对方单独了解原因，再调整分工。不在公开场合批评，也不绕过对方直接找他上级。</w:t>
+        <w:t>可以向学校人事处申请查询本人成绩和排名。认为流程有问题，可以向学校纪委或主管部门反映。2026年8月，佛山一所中学招聘被查实以毕业院校知名度筛人，当地通报面试成绩无效，并重新组织面试。</w:t>
       </w:r>
     </w:p>
     <w:p>
@@ -350,23 +378,7 @@
         <w:spacing w:after="160"/>
       </w:pPr>
       <w:r>
-        <w:t>练习的时候用手机计时录音，每题控制在三分钟左右，听回放删掉重复的话。考官在意的，是你能不能把一件事办完、办到位。</w:t>
-      </w:r>
-    </w:p>
-    <w:p>
-      <w:pPr>
-        <w:spacing w:after="160"/>
-      </w:pPr>
-      <w:r>
-        <w:t>辅导员岗位的应急题和人际题会更多，常见学生心理危机、宿舍矛盾、网络舆情。</w:t>
-      </w:r>
-    </w:p>
-    <w:p>
-      <w:pPr>
-        <w:spacing w:after="160"/>
-      </w:pPr>
-      <w:r>
-        <w:t>你最怕哪一类：岗位认知、应急，还是人际？评论区打出来，我按这一类出题。</w:t>
+        <w:t>你面试时最难的是哪一类题？评论区说说。</w:t>
       </w:r>
     </w:p>
     <w:p>
@@ -378,8 +390,11 @@
       </w:r>
     </w:p>
     <w:p>
+      <w:pPr>
+        <w:spacing w:after="160"/>
+      </w:pPr>
       <w:r>
-        <w:t>#高校面试 #结构化面试 #高校行政 #辅导员面试 #高校管理岗面试 #事业编面试</w:t>
+        <w:t>#高校面试 #结构化面试 #面试被刷 #高校辅导员 #高校行政 #事业编面试</w:t>
       </w:r>
     </w:p>
     <w:p>
@@ -391,8 +406,11 @@
       </w:r>
     </w:p>
     <w:p>
+      <w:pPr>
+        <w:spacing w:after="160"/>
+      </w:pPr>
       <w:r>
-        <w:t>先看公告的成绩比例，很多是笔试40%、面试60%。结构化面试五类题：岗位认知、综合分析、组织协调、应急应变、人际沟通。用手机计时录音，每题三分钟左右。</w:t>
+        <w:t>先看公告：面试是不是占60%到70%，有没有70分合格线。练题时先画框架，录音练到流利。对结果有疑问，可以申请查本人成绩和排名。</w:t>
       </w:r>
     </w:p>
     <w:p>
@@ -405,7 +423,17 @@
         <w:pStyle w:val="Heading1"/>
       </w:pPr>
       <w:r>
-        <w:t>第7篇｜辅导员还是行政岗</w:t>
+        <w:t>第7篇｜不是党员能报辅导员吗</w:t>
+      </w:r>
+    </w:p>
+    <w:p>
+      <w:r>
+        <w:rPr>
+          <w:i/>
+          <w:color w:val="666666"/>
+          <w:sz w:val="18"/>
+        </w:rPr>
+        <w:t>讨论来源：求职论坛里“因为不是党员没过简历筛选”的分享；高校人才网“在高校做辅导员是不是好选择”等文章下的提问。事实依据：山东大学、江苏师范大学、南通大学、南京信息工程大学、兰州城市学院2026年专职辅导员招聘公告。</w:t>
       </w:r>
     </w:p>
     <w:p>
@@ -417,8 +445,11 @@
       </w:r>
     </w:p>
     <w:p>
+      <w:pPr>
+        <w:spacing w:after="160"/>
+      </w:pPr>
       <w:r>
-        <w:t>辅导员和行政岗怎么选</w:t>
+        <w:t>不是党员能报辅导员吗</w:t>
       </w:r>
     </w:p>
     <w:p>
@@ -430,13 +461,15 @@
       </w:r>
     </w:p>
     <w:p>
+      <w:pPr>
+        <w:spacing w:after="160"/>
+      </w:pPr>
       <w:r>
-        <w:t>辅导员门槛高</w:t>
+        <w:t>党员是门槛</w:t>
+        <w:br/>
       </w:r>
-    </w:p>
-    <w:p>
       <w:r>
-        <w:t>晋升路多一条</w:t>
+        <w:t>学生干部也是</w:t>
       </w:r>
     </w:p>
     <w:p>
@@ -452,7 +485,7 @@
         <w:spacing w:after="160"/>
       </w:pPr>
       <w:r>
-        <w:t>同一所学校，常常辅导员和管理岗一起招。两类岗位的报名条件、考法和日常工作差得不少。先看自己卡在哪一条，再决定报哪个。</w:t>
+        <w:t>“不是党员能不能报辅导员？”这是辅导员招聘里被问得最多的问题。我翻了几所学校2026年的公告：山东大学、江苏师范大学、南通大学、南京信息工程大学、兰州城市学院，专职辅导员都要求中共党员，预备党员也可以。</w:t>
       </w:r>
     </w:p>
     <w:p>
@@ -463,15 +496,15 @@
         <w:rPr>
           <w:b/>
         </w:rPr>
-        <w:t>1⃣️报名条件</w:t>
+        <w:t>1⃣️党员要到什么时候</w:t>
         <w:br/>
       </w:r>
       <w:r>
-        <w:t>辅导员岗位常把中共党员（含预备党员）、本科或研究生阶段学生干部经历写成硬条件。2026年有的学校要求学生干部满一年，证明还要校级学生工作部门开。年龄往往比管理岗低，也有学校按男、女分别设岗。</w:t>
+        <w:t>南通大学写的是入党时间截止到报名之日。资格复审要党组织出具的证明，写明入党时间。正在发展、还没成为预备党员的，一般报不了。</w:t>
         <w:br/>
       </w:r>
       <w:r>
-        <w:t>管理岗也有要求党员的，但更多看专业和学历。办公室、教务、财务、人事这些岗位，专业限制会写得更细。</w:t>
+        <w:t>不是党员的，可以看同一所学校的管理岗。很多管理岗只看学历和专业，不要求党员。</w:t>
       </w:r>
     </w:p>
     <w:p>
@@ -482,11 +515,19 @@
         <w:rPr>
           <w:b/>
         </w:rPr>
-        <w:t>2⃣️考什么</w:t>
+        <w:t>2⃣️学生干部怎么才算</w:t>
         <w:br/>
       </w:r>
       <w:r>
-        <w:t>管理岗笔试多是行测、公共基础、公文，具体看公告。辅导员笔试常加思想政治教育、学生管理规定、《普通高等学校辅导员队伍建设规定》，面试里学生危机处理的题更多。</w:t>
+        <w:t>江苏几所学校的写法基本相同：本科或研究生期间担任主要学生干部满1年。主要学生干部指正副班长、团支部书记、党支部书记或副书记；学院学生组织正部长及以上；学校学生组织副部长及以上。普通社团成员、干事不算。</w:t>
+        <w:br/>
+      </w:r>
+      <w:r>
+        <w:t>没有学生干部经历，也可以用1年以上高校辅导员工作经历，或3年以上企事业单位专职思想政治工作经历替代。</w:t>
+        <w:br/>
+      </w:r>
+      <w:r>
+        <w:t>证明由谁开也有规定：学院职务由学院党组织开，校级职务由校团委或学生工作部门开。</w:t>
       </w:r>
     </w:p>
     <w:p>
@@ -497,11 +538,11 @@
         <w:rPr>
           <w:b/>
         </w:rPr>
-        <w:t>3⃣️身份和晋升</w:t>
+        <w:t>3⃣️还有这些硬条件</w:t>
         <w:br/>
       </w:r>
       <w:r>
-        <w:t>按教育部第43号令，专职辅导员有教师和管理人员双重身份。学校要落实职务职级“双线”晋升：可以评思想政治教育等学科的职称，也可以按管理岗走职级。职称评审单列计划、单设标准。管理岗主要按管理岗位等级晋升。</w:t>
+        <w:t>年龄多数不超过38周岁。有的学校按男女分岗，山东大学的男生公寓辅导员岗要求入住男生宿舍。山东大学还要求英语六级425分以上。</w:t>
       </w:r>
     </w:p>
     <w:p>
@@ -512,15 +553,11 @@
         <w:rPr>
           <w:b/>
         </w:rPr>
-        <w:t>4⃣️日常工作</w:t>
+        <w:t>4⃣️入职以后</w:t>
         <w:br/>
       </w:r>
       <w:r>
-        <w:t>第43号令要求专职辅导员总体按师生比不低于1:200配备，一个人常带两三百名学生。学生出事要随时响应，夜里、假期接电话是常态，有的学校要求入住学生公寓。</w:t>
-        <w:br/>
-      </w:r>
-      <w:r>
-        <w:t>管理岗跟着部门节奏走，忙闲看部门：招生季的招生办、开学和期末的教务处、年底的财务处会很忙，平时作息相对规律。</w:t>
+        <w:t>江苏师范大学写明，聘用后须在辅导员岗位服务4年以上。也有学校是预聘制，三年期满考核。报名前把聘用方式和服务年限看清楚。</w:t>
       </w:r>
     </w:p>
     <w:p>
@@ -531,11 +568,11 @@
         <w:rPr>
           <w:b/>
         </w:rPr>
-        <w:t>5⃣️怎么选</w:t>
+        <w:t>5⃣️值不值得</w:t>
         <w:br/>
       </w:r>
       <w:r>
-        <w:t>你是党员、有学生干部经历，能接受随时处理学生的事，想留一条评职称的路，可以优先报辅导员。不是党员，或者更想做文字、财务、人事这类固定业务，就盯管理岗里专业对口的岗位。两类都符合的，看同一场的报名人数和招聘人数，再定报哪个。</w:t>
+        <w:t>高校人才网的分析和不少辅导员的分享都提到：辅导员可以按职称和职级两条线晋升，但学生的事随时找上门，寒暑假也有培训和值班。能接受这种节奏的人，再报辅导员。</w:t>
       </w:r>
     </w:p>
     <w:p>
@@ -543,7 +580,7 @@
         <w:spacing w:after="160"/>
       </w:pPr>
       <w:r>
-        <w:t>你现在两类都符合，还是只符合其中一类？评论区说说你卡在哪一条。</w:t>
+        <w:t>你现在卡在党员、学生干部，还是年龄？评论区说说。</w:t>
       </w:r>
     </w:p>
     <w:p>
@@ -555,8 +592,11 @@
       </w:r>
     </w:p>
     <w:p>
+      <w:pPr>
+        <w:spacing w:after="160"/>
+      </w:pPr>
       <w:r>
-        <w:t>#高校辅导员 #高校行政 #辅导员招聘 #高校管理岗 #事业编 #高校求职</w:t>
+        <w:t>#高校辅导员 #辅导员招聘 #辅导员备考 #高校招聘 #高校行政 #事业编</w:t>
       </w:r>
     </w:p>
     <w:p>
@@ -568,8 +608,11 @@
       </w:r>
     </w:p>
     <w:p>
+      <w:pPr>
+        <w:spacing w:after="160"/>
+      </w:pPr>
       <w:r>
-        <w:t>辅导员常见硬条件：党员、学生干部经历，年龄更低。按第43号令，专职辅导员可以评职称，也可以走管理职级，但要按约1:200带学生。管理岗看专业和部门。</w:t>
+        <w:t>2026年多所高校专职辅导员都要求党员，含预备党员，入党时间算到报名之日。学生干部要满1年，干事不算。不是党员的可以看同校管理岗。</w:t>
       </w:r>
     </w:p>
     <w:sectPr>

</xml_diff>